<commit_message>
fixed these two errors
</commit_message>
<xml_diff>
--- a/important docs/module.docx
+++ b/important docs/module.docx
@@ -98,14 +98,23 @@
       </w:r>
     </w:p>
     <w:p>
+      <w:pPr>
+        <w:rPr>
+          <w:color w:val="00B050"/>
+        </w:rPr>
+      </w:pPr>
       <w:r>
         <w:rPr>
           <w:b/>
           <w:bCs/>
+          <w:color w:val="00B050"/>
         </w:rPr>
         <w:t>Module 5:</w:t>
       </w:r>
       <w:r>
+        <w:rPr>
+          <w:color w:val="00B050"/>
+        </w:rPr>
         <w:t xml:space="preserve"> Live Monitoring Client Service</w:t>
       </w:r>
     </w:p>

</xml_diff>